<commit_message>
Adicionado versão do projeto em Release e manuais alterados e adicionado no Release.
</commit_message>
<xml_diff>
--- a/GestaoFrota/GUIA RÁPIDO DE UTILIZAÇÃO DO GESTÃO DE FROTA PORTABLE.docx
+++ b/GestaoFrota/GUIA RÁPIDO DE UTILIZAÇÃO DO GESTÃO DE FROTA PORTABLE.docx
@@ -31,8 +31,6 @@
           <w:szCs w:val="24"/>
         </w:rPr>
       </w:pPr>
-      <w:bookmarkStart w:id="0" w:name="_GoBack"/>
-      <w:bookmarkEnd w:id="0"/>
     </w:p>
     <w:p>
       <w:pPr>
@@ -1293,37 +1291,17 @@
     </w:p>
     <w:p>
       <w:pPr>
-        <w:rPr>
-          <w:rFonts w:ascii="Arial" w:hAnsi="Arial" w:cs="Arial"/>
+        <w:pStyle w:val="Ttulo1"/>
+        <w:rPr>
+          <w:rFonts w:ascii="Times New Roman" w:hAnsi="Times New Roman" w:cs="Times New Roman"/>
           <w:b/>
           <w:sz w:val="24"/>
           <w:szCs w:val="24"/>
         </w:rPr>
       </w:pPr>
-    </w:p>
-    <w:p>
-      <w:pPr>
-        <w:rPr>
-          <w:rFonts w:ascii="Arial" w:hAnsi="Arial" w:cs="Arial"/>
-          <w:b/>
-          <w:sz w:val="24"/>
-          <w:szCs w:val="24"/>
-        </w:rPr>
-      </w:pPr>
-    </w:p>
-    <w:p>
-      <w:pPr>
-        <w:pStyle w:val="Ttulo1"/>
-        <w:rPr>
-          <w:rFonts w:ascii="Times New Roman" w:hAnsi="Times New Roman" w:cs="Times New Roman"/>
-          <w:b/>
-          <w:sz w:val="24"/>
-          <w:szCs w:val="24"/>
-        </w:rPr>
-      </w:pPr>
+      <w:bookmarkStart w:id="0" w:name="_Toc516760236"/>
       <w:bookmarkStart w:id="1" w:name="OLE_LINK1"/>
       <w:bookmarkStart w:id="2" w:name="OLE_LINK2"/>
-      <w:bookmarkStart w:id="3" w:name="_Toc516760236"/>
       <w:r>
         <w:rPr>
           <w:rFonts w:ascii="Times New Roman" w:hAnsi="Times New Roman" w:cs="Times New Roman"/>
@@ -1331,9 +1309,10 @@
           <w:sz w:val="24"/>
           <w:szCs w:val="24"/>
         </w:rPr>
+        <w:lastRenderedPageBreak/>
         <w:t>GUIA RÁPIDO DE UTILIZAÇÃO DO GESTÃO DE FROTA PORTABLE</w:t>
       </w:r>
-      <w:bookmarkEnd w:id="3"/>
+      <w:bookmarkEnd w:id="0"/>
     </w:p>
     <w:p>
       <w:pPr>
@@ -1401,7 +1380,7 @@
               </wp:anchor>
             </w:drawing>
           </mc:Choice>
-          <mc:Fallback xmlns:cx2="http://schemas.microsoft.com/office/drawing/2015/10/21/chartex" xmlns:cx3="http://schemas.microsoft.com/office/drawing/2016/5/9/chartex" xmlns:cx4="http://schemas.microsoft.com/office/drawing/2016/5/10/chartex" xmlns:cx5="http://schemas.microsoft.com/office/drawing/2016/5/11/chartex" xmlns:cx6="http://schemas.microsoft.com/office/drawing/2016/5/12/chartex" xmlns:cx7="http://schemas.microsoft.com/office/drawing/2016/5/13/chartex" xmlns:cx8="http://schemas.microsoft.com/office/drawing/2016/5/14/chartex" xmlns:aink="http://schemas.microsoft.com/office/drawing/2016/ink" xmlns:am3d="http://schemas.microsoft.com/office/drawing/2017/model3d" xmlns:w16cid="http://schemas.microsoft.com/office/word/2016/wordml/cid">
+          <mc:Fallback xmlns:w16cid="http://schemas.microsoft.com/office/word/2016/wordml/cid" xmlns:am3d="http://schemas.microsoft.com/office/drawing/2017/model3d" xmlns:aink="http://schemas.microsoft.com/office/drawing/2016/ink" xmlns:cx8="http://schemas.microsoft.com/office/drawing/2016/5/14/chartex" xmlns:cx7="http://schemas.microsoft.com/office/drawing/2016/5/13/chartex" xmlns:cx6="http://schemas.microsoft.com/office/drawing/2016/5/12/chartex" xmlns:cx5="http://schemas.microsoft.com/office/drawing/2016/5/11/chartex" xmlns:cx4="http://schemas.microsoft.com/office/drawing/2016/5/10/chartex" xmlns:cx3="http://schemas.microsoft.com/office/drawing/2016/5/9/chartex" xmlns:cx2="http://schemas.microsoft.com/office/drawing/2015/10/21/chartex">
             <w:pict>
               <v:line w14:anchorId="7D879917" id="Conexão reta 1" o:spid="_x0000_s1026" style="position:absolute;z-index:251659264;visibility:visible;mso-wrap-style:square;mso-wrap-distance-left:9pt;mso-wrap-distance-top:0;mso-wrap-distance-right:9pt;mso-wrap-distance-bottom:0;mso-position-horizontal:absolute;mso-position-horizontal-relative:text;mso-position-vertical:absolute;mso-position-vertical-relative:text" from="-6.3pt,7.15pt" to="448.95pt,7.15pt" o:gfxdata="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" strokecolor="#4472c4 [3204]" strokeweight=".5pt">
                 <v:stroke joinstyle="miter"/>
@@ -1535,7 +1514,7 @@
           <w:szCs w:val="24"/>
         </w:rPr>
       </w:pPr>
-      <w:bookmarkStart w:id="4" w:name="_Toc516760237"/>
+      <w:bookmarkStart w:id="3" w:name="_Toc516760237"/>
       <w:r>
         <w:rPr>
           <w:rFonts w:ascii="Times New Roman" w:hAnsi="Times New Roman" w:cs="Times New Roman"/>
@@ -1545,7 +1524,7 @@
         </w:rPr>
         <w:t>REQUISITOS</w:t>
       </w:r>
-      <w:bookmarkEnd w:id="4"/>
+      <w:bookmarkEnd w:id="3"/>
     </w:p>
     <w:p>
       <w:pPr>
@@ -1613,7 +1592,7 @@
               </wp:anchor>
             </w:drawing>
           </mc:Choice>
-          <mc:Fallback xmlns:cx2="http://schemas.microsoft.com/office/drawing/2015/10/21/chartex" xmlns:cx3="http://schemas.microsoft.com/office/drawing/2016/5/9/chartex" xmlns:cx4="http://schemas.microsoft.com/office/drawing/2016/5/10/chartex" xmlns:cx5="http://schemas.microsoft.com/office/drawing/2016/5/11/chartex" xmlns:cx6="http://schemas.microsoft.com/office/drawing/2016/5/12/chartex" xmlns:cx7="http://schemas.microsoft.com/office/drawing/2016/5/13/chartex" xmlns:cx8="http://schemas.microsoft.com/office/drawing/2016/5/14/chartex" xmlns:aink="http://schemas.microsoft.com/office/drawing/2016/ink" xmlns:am3d="http://schemas.microsoft.com/office/drawing/2017/model3d" xmlns:w16cid="http://schemas.microsoft.com/office/word/2016/wordml/cid">
+          <mc:Fallback xmlns:w16cid="http://schemas.microsoft.com/office/word/2016/wordml/cid" xmlns:am3d="http://schemas.microsoft.com/office/drawing/2017/model3d" xmlns:aink="http://schemas.microsoft.com/office/drawing/2016/ink" xmlns:cx8="http://schemas.microsoft.com/office/drawing/2016/5/14/chartex" xmlns:cx7="http://schemas.microsoft.com/office/drawing/2016/5/13/chartex" xmlns:cx6="http://schemas.microsoft.com/office/drawing/2016/5/12/chartex" xmlns:cx5="http://schemas.microsoft.com/office/drawing/2016/5/11/chartex" xmlns:cx4="http://schemas.microsoft.com/office/drawing/2016/5/10/chartex" xmlns:cx3="http://schemas.microsoft.com/office/drawing/2016/5/9/chartex" xmlns:cx2="http://schemas.microsoft.com/office/drawing/2015/10/21/chartex">
             <w:pict>
               <v:line w14:anchorId="6983E19F" id="Conexão reta 2" o:spid="_x0000_s1026" style="position:absolute;z-index:251661312;visibility:visible;mso-wrap-style:square;mso-wrap-distance-left:9pt;mso-wrap-distance-top:0;mso-wrap-distance-right:9pt;mso-wrap-distance-bottom:0;mso-position-horizontal:absolute;mso-position-horizontal-relative:text;mso-position-vertical:absolute;mso-position-vertical-relative:text" from="-6.3pt,7.15pt" to="448.95pt,7.15pt" o:gfxdata="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" strokecolor="#4472c4 [3204]" strokeweight=".5pt">
                 <v:stroke joinstyle="miter"/>
@@ -1696,7 +1675,7 @@
           <w:szCs w:val="24"/>
         </w:rPr>
       </w:pPr>
-      <w:bookmarkStart w:id="5" w:name="_Toc516760238"/>
+      <w:bookmarkStart w:id="4" w:name="_Toc516760238"/>
       <w:r>
         <w:rPr>
           <w:rFonts w:ascii="Times New Roman" w:hAnsi="Times New Roman" w:cs="Times New Roman"/>
@@ -1706,7 +1685,7 @@
         </w:rPr>
         <w:t>COMO EXECUTAR</w:t>
       </w:r>
-      <w:bookmarkEnd w:id="5"/>
+      <w:bookmarkEnd w:id="4"/>
     </w:p>
     <w:p>
       <w:pPr>
@@ -1774,7 +1753,7 @@
               </wp:anchor>
             </w:drawing>
           </mc:Choice>
-          <mc:Fallback xmlns:cx2="http://schemas.microsoft.com/office/drawing/2015/10/21/chartex" xmlns:cx3="http://schemas.microsoft.com/office/drawing/2016/5/9/chartex" xmlns:cx4="http://schemas.microsoft.com/office/drawing/2016/5/10/chartex" xmlns:cx5="http://schemas.microsoft.com/office/drawing/2016/5/11/chartex" xmlns:cx6="http://schemas.microsoft.com/office/drawing/2016/5/12/chartex" xmlns:cx7="http://schemas.microsoft.com/office/drawing/2016/5/13/chartex" xmlns:cx8="http://schemas.microsoft.com/office/drawing/2016/5/14/chartex" xmlns:aink="http://schemas.microsoft.com/office/drawing/2016/ink" xmlns:am3d="http://schemas.microsoft.com/office/drawing/2017/model3d" xmlns:w16cid="http://schemas.microsoft.com/office/word/2016/wordml/cid">
+          <mc:Fallback xmlns:w16cid="http://schemas.microsoft.com/office/word/2016/wordml/cid" xmlns:am3d="http://schemas.microsoft.com/office/drawing/2017/model3d" xmlns:aink="http://schemas.microsoft.com/office/drawing/2016/ink" xmlns:cx8="http://schemas.microsoft.com/office/drawing/2016/5/14/chartex" xmlns:cx7="http://schemas.microsoft.com/office/drawing/2016/5/13/chartex" xmlns:cx6="http://schemas.microsoft.com/office/drawing/2016/5/12/chartex" xmlns:cx5="http://schemas.microsoft.com/office/drawing/2016/5/11/chartex" xmlns:cx4="http://schemas.microsoft.com/office/drawing/2016/5/10/chartex" xmlns:cx3="http://schemas.microsoft.com/office/drawing/2016/5/9/chartex" xmlns:cx2="http://schemas.microsoft.com/office/drawing/2015/10/21/chartex">
             <w:pict>
               <v:line w14:anchorId="333CEE15" id="Conexão reta 3" o:spid="_x0000_s1026" style="position:absolute;z-index:251663360;visibility:visible;mso-wrap-style:square;mso-wrap-distance-left:9pt;mso-wrap-distance-top:0;mso-wrap-distance-right:9pt;mso-wrap-distance-bottom:0;mso-position-horizontal:absolute;mso-position-horizontal-relative:text;mso-position-vertical:absolute;mso-position-vertical-relative:text" from="-6.3pt,7.15pt" to="448.95pt,7.15pt" o:gfxdata="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" strokecolor="#4472c4 [3204]" strokeweight=".5pt">
                 <v:stroke joinstyle="miter"/>
@@ -1876,40 +1855,51 @@
           <w:sz w:val="24"/>
           <w:szCs w:val="24"/>
         </w:rPr>
+        <w:t>Para abrir execute o GestaoFrota.exe, conforme destaque na imagem.</w:t>
+      </w:r>
+    </w:p>
+    <w:p>
+      <w:pPr>
+        <w:rPr>
+          <w:rFonts w:ascii="Times New Roman" w:hAnsi="Times New Roman" w:cs="Times New Roman"/>
+          <w:sz w:val="24"/>
+          <w:szCs w:val="24"/>
+        </w:rPr>
+      </w:pPr>
+    </w:p>
+    <w:p>
+      <w:pPr>
+        <w:pStyle w:val="Ttulo1"/>
+        <w:rPr>
+          <w:rFonts w:ascii="Times New Roman" w:hAnsi="Times New Roman" w:cs="Times New Roman"/>
+          <w:b/>
+          <w:sz w:val="24"/>
+          <w:szCs w:val="24"/>
+        </w:rPr>
+      </w:pPr>
+      <w:bookmarkStart w:id="5" w:name="_Toc516760239"/>
+      <w:r>
+        <w:rPr>
+          <w:rFonts w:ascii="Times New Roman" w:hAnsi="Times New Roman" w:cs="Times New Roman"/>
+          <w:b/>
+          <w:sz w:val="24"/>
+          <w:szCs w:val="24"/>
+        </w:rPr>
         <w:lastRenderedPageBreak/>
-        <w:t>Para abrir execute o GestaoFrota.exe, conforme destaque na imagem.</w:t>
-      </w:r>
-    </w:p>
-    <w:p>
-      <w:pPr>
-        <w:rPr>
-          <w:rFonts w:ascii="Times New Roman" w:hAnsi="Times New Roman" w:cs="Times New Roman"/>
-          <w:sz w:val="24"/>
-          <w:szCs w:val="24"/>
-        </w:rPr>
-      </w:pPr>
-    </w:p>
-    <w:p>
-      <w:pPr>
-        <w:pStyle w:val="Ttulo1"/>
+        <w:t>P</w:t>
+      </w:r>
+      <w:bookmarkStart w:id="6" w:name="_GoBack"/>
+      <w:bookmarkEnd w:id="6"/>
+      <w:r>
         <w:rPr>
           <w:rFonts w:ascii="Times New Roman" w:hAnsi="Times New Roman" w:cs="Times New Roman"/>
           <w:b/>
           <w:sz w:val="24"/>
           <w:szCs w:val="24"/>
         </w:rPr>
-      </w:pPr>
-      <w:bookmarkStart w:id="6" w:name="_Toc516760239"/>
-      <w:r>
-        <w:rPr>
-          <w:rFonts w:ascii="Times New Roman" w:hAnsi="Times New Roman" w:cs="Times New Roman"/>
-          <w:b/>
-          <w:sz w:val="24"/>
-          <w:szCs w:val="24"/>
-        </w:rPr>
-        <w:t>PRIMEIRA EXECUÇÃO</w:t>
-      </w:r>
-      <w:bookmarkEnd w:id="6"/>
+        <w:t>RIMEIRA EXECUÇÃO</w:t>
+      </w:r>
+      <w:bookmarkEnd w:id="5"/>
     </w:p>
     <w:p>
       <w:pPr>
@@ -1977,7 +1967,7 @@
               </wp:anchor>
             </w:drawing>
           </mc:Choice>
-          <mc:Fallback xmlns:cx2="http://schemas.microsoft.com/office/drawing/2015/10/21/chartex" xmlns:cx3="http://schemas.microsoft.com/office/drawing/2016/5/9/chartex" xmlns:cx4="http://schemas.microsoft.com/office/drawing/2016/5/10/chartex" xmlns:cx5="http://schemas.microsoft.com/office/drawing/2016/5/11/chartex" xmlns:cx6="http://schemas.microsoft.com/office/drawing/2016/5/12/chartex" xmlns:cx7="http://schemas.microsoft.com/office/drawing/2016/5/13/chartex" xmlns:cx8="http://schemas.microsoft.com/office/drawing/2016/5/14/chartex" xmlns:aink="http://schemas.microsoft.com/office/drawing/2016/ink" xmlns:am3d="http://schemas.microsoft.com/office/drawing/2017/model3d" xmlns:w16cid="http://schemas.microsoft.com/office/word/2016/wordml/cid">
+          <mc:Fallback xmlns:w16cid="http://schemas.microsoft.com/office/word/2016/wordml/cid" xmlns:am3d="http://schemas.microsoft.com/office/drawing/2017/model3d" xmlns:aink="http://schemas.microsoft.com/office/drawing/2016/ink" xmlns:cx8="http://schemas.microsoft.com/office/drawing/2016/5/14/chartex" xmlns:cx7="http://schemas.microsoft.com/office/drawing/2016/5/13/chartex" xmlns:cx6="http://schemas.microsoft.com/office/drawing/2016/5/12/chartex" xmlns:cx5="http://schemas.microsoft.com/office/drawing/2016/5/11/chartex" xmlns:cx4="http://schemas.microsoft.com/office/drawing/2016/5/10/chartex" xmlns:cx3="http://schemas.microsoft.com/office/drawing/2016/5/9/chartex" xmlns:cx2="http://schemas.microsoft.com/office/drawing/2015/10/21/chartex">
             <w:pict>
               <v:line w14:anchorId="054FFA40" id="Conexão reta 5" o:spid="_x0000_s1026" style="position:absolute;z-index:251665408;visibility:visible;mso-wrap-style:square;mso-wrap-distance-left:9pt;mso-wrap-distance-top:0;mso-wrap-distance-right:9pt;mso-wrap-distance-bottom:0;mso-position-horizontal:absolute;mso-position-horizontal-relative:text;mso-position-vertical:absolute;mso-position-vertical-relative:text" from="-6.3pt,7.15pt" to="448.95pt,7.15pt" o:gfxdata="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" strokecolor="#4472c4 [3204]" strokeweight=".5pt">
                 <v:stroke joinstyle="miter"/>
@@ -2184,33 +2174,33 @@
           <w:sz w:val="24"/>
           <w:szCs w:val="24"/>
         </w:rPr>
+        <w:t>Para cadastrar, o sistema irá usar como base as informações da FIPE, acessando direto seus servidores, então ao selecionar o tipo, deve aguardar alguns segundos para carregar a opção de fabricante, para na sequencia pode escolher, e assim por diante, cada lista é atualizada conforme a opção anterior selecionado.</w:t>
+      </w:r>
+      <w:r>
+        <w:rPr>
+          <w:rFonts w:ascii="Times New Roman" w:hAnsi="Times New Roman" w:cs="Times New Roman"/>
+          <w:sz w:val="24"/>
+          <w:szCs w:val="24"/>
+        </w:rPr>
+        <w:t xml:space="preserve"> </w:t>
+      </w:r>
+    </w:p>
+    <w:p>
+      <w:pPr>
+        <w:jc w:val="both"/>
+        <w:rPr>
+          <w:rFonts w:ascii="Times New Roman" w:hAnsi="Times New Roman" w:cs="Times New Roman"/>
+          <w:sz w:val="24"/>
+          <w:szCs w:val="24"/>
+        </w:rPr>
+      </w:pPr>
+      <w:r>
+        <w:rPr>
+          <w:rFonts w:ascii="Times New Roman" w:hAnsi="Times New Roman" w:cs="Times New Roman"/>
+          <w:sz w:val="24"/>
+          <w:szCs w:val="24"/>
+        </w:rPr>
         <w:lastRenderedPageBreak/>
-        <w:t>Para cadastrar, o sistema irá usar como base as informações da FIPE, acessando direto seus servidores, então ao selecionar o tipo, deve aguardar alguns segundos para carregar a opção de fabricante, para na sequencia pode escolher, e assim por diante, cada lista é atualizada conforme a opção anterior selecionado.</w:t>
-      </w:r>
-      <w:r>
-        <w:rPr>
-          <w:rFonts w:ascii="Times New Roman" w:hAnsi="Times New Roman" w:cs="Times New Roman"/>
-          <w:sz w:val="24"/>
-          <w:szCs w:val="24"/>
-        </w:rPr>
-        <w:t xml:space="preserve"> </w:t>
-      </w:r>
-    </w:p>
-    <w:p>
-      <w:pPr>
-        <w:jc w:val="both"/>
-        <w:rPr>
-          <w:rFonts w:ascii="Times New Roman" w:hAnsi="Times New Roman" w:cs="Times New Roman"/>
-          <w:sz w:val="24"/>
-          <w:szCs w:val="24"/>
-        </w:rPr>
-      </w:pPr>
-      <w:r>
-        <w:rPr>
-          <w:rFonts w:ascii="Times New Roman" w:hAnsi="Times New Roman" w:cs="Times New Roman"/>
-          <w:sz w:val="24"/>
-          <w:szCs w:val="24"/>
-        </w:rPr>
         <w:t>É muito importante neste momento ter internet, pois como informado, o sistema utiliza os dados da FIPE, para garantir os dados atualizados</w:t>
       </w:r>
       <w:r>
@@ -2445,6 +2435,7 @@
           <w:noProof/>
           <w:lang w:eastAsia="pt-BR"/>
         </w:rPr>
+        <w:lastRenderedPageBreak/>
         <w:drawing>
           <wp:inline distT="0" distB="0" distL="0" distR="0" wp14:anchorId="241F2D17" wp14:editId="4D7D44C8">
             <wp:extent cx="2924175" cy="2211617"/>
@@ -2542,9 +2533,9 @@
           <w:szCs w:val="24"/>
         </w:rPr>
       </w:pPr>
-      <w:bookmarkStart w:id="7" w:name="OLE_LINK3"/>
-      <w:bookmarkStart w:id="8" w:name="OLE_LINK4"/>
-      <w:bookmarkStart w:id="9" w:name="_Toc516760240"/>
+      <w:bookmarkStart w:id="7" w:name="_Toc516760240"/>
+      <w:bookmarkStart w:id="8" w:name="OLE_LINK3"/>
+      <w:bookmarkStart w:id="9" w:name="OLE_LINK4"/>
       <w:r>
         <w:rPr>
           <w:rFonts w:ascii="Times New Roman" w:hAnsi="Times New Roman" w:cs="Times New Roman"/>
@@ -2563,7 +2554,7 @@
         </w:rPr>
         <w:t xml:space="preserve"> DE DADOS DO VEICULO</w:t>
       </w:r>
-      <w:bookmarkEnd w:id="9"/>
+      <w:bookmarkEnd w:id="7"/>
     </w:p>
     <w:p>
       <w:pPr>
@@ -2649,8 +2640,8 @@
         <w:t xml:space="preserve">                  </w:t>
       </w:r>
     </w:p>
-    <w:bookmarkEnd w:id="7"/>
     <w:bookmarkEnd w:id="8"/>
+    <w:bookmarkEnd w:id="9"/>
     <w:p>
       <w:pPr>
         <w:rPr>
@@ -2817,6 +2808,7 @@
           <w:noProof/>
           <w:lang w:eastAsia="pt-BR"/>
         </w:rPr>
+        <w:lastRenderedPageBreak/>
         <w:drawing>
           <wp:inline distT="0" distB="0" distL="0" distR="0" wp14:anchorId="05162F65" wp14:editId="5C76A57E">
             <wp:extent cx="5400040" cy="2664460"/>
@@ -3987,9 +3979,9 @@
           <w:szCs w:val="24"/>
         </w:rPr>
       </w:pPr>
-      <w:bookmarkStart w:id="13" w:name="OLE_LINK5"/>
-      <w:bookmarkStart w:id="14" w:name="OLE_LINK6"/>
-      <w:bookmarkStart w:id="15" w:name="_Toc516760244"/>
+      <w:bookmarkStart w:id="13" w:name="_Toc516760244"/>
+      <w:bookmarkStart w:id="14" w:name="OLE_LINK5"/>
+      <w:bookmarkStart w:id="15" w:name="OLE_LINK6"/>
       <w:r>
         <w:rPr>
           <w:rFonts w:ascii="Times New Roman" w:hAnsi="Times New Roman" w:cs="Times New Roman"/>
@@ -4009,7 +4001,7 @@
         </w:rPr>
         <w:t xml:space="preserve"> DE DADOS DE MANUTENÇÃO</w:t>
       </w:r>
-      <w:bookmarkEnd w:id="15"/>
+      <w:bookmarkEnd w:id="13"/>
     </w:p>
     <w:p>
       <w:pPr>
@@ -4095,8 +4087,8 @@
         <w:t xml:space="preserve">                  </w:t>
       </w:r>
     </w:p>
-    <w:bookmarkEnd w:id="13"/>
     <w:bookmarkEnd w:id="14"/>
+    <w:bookmarkEnd w:id="15"/>
     <w:p>
       <w:pPr>
         <w:rPr>
@@ -4201,9 +4193,9 @@
           <w:szCs w:val="24"/>
         </w:rPr>
       </w:pPr>
-      <w:bookmarkStart w:id="16" w:name="OLE_LINK7"/>
-      <w:bookmarkStart w:id="17" w:name="OLE_LINK8"/>
-      <w:bookmarkStart w:id="18" w:name="_Toc516760245"/>
+      <w:bookmarkStart w:id="16" w:name="_Toc516760245"/>
+      <w:bookmarkStart w:id="17" w:name="OLE_LINK7"/>
+      <w:bookmarkStart w:id="18" w:name="OLE_LINK8"/>
       <w:r>
         <w:rPr>
           <w:rFonts w:ascii="Times New Roman" w:hAnsi="Times New Roman" w:cs="Times New Roman"/>
@@ -4213,7 +4205,7 @@
         </w:rPr>
         <w:t>ABA DE DADOS DE SEGURO</w:t>
       </w:r>
-      <w:bookmarkEnd w:id="18"/>
+      <w:bookmarkEnd w:id="16"/>
     </w:p>
     <w:p>
       <w:pPr>
@@ -4299,8 +4291,8 @@
         <w:t xml:space="preserve">                  </w:t>
       </w:r>
     </w:p>
-    <w:bookmarkEnd w:id="16"/>
     <w:bookmarkEnd w:id="17"/>
+    <w:bookmarkEnd w:id="18"/>
     <w:p>
       <w:pPr>
         <w:rPr>
@@ -5841,7 +5833,7 @@
           <w:rPr>
             <w:noProof/>
           </w:rPr>
-          <w:t>1</w:t>
+          <w:t>15</w:t>
         </w:r>
         <w:r>
           <w:fldChar w:fldCharType="end"/>
@@ -6842,7 +6834,7 @@
 </file>
 
 <file path=customXml/itemProps1.xml><?xml version="1.0" encoding="utf-8"?>
-<ds:datastoreItem xmlns:ds="http://schemas.openxmlformats.org/officeDocument/2006/customXml" ds:itemID="{59317483-2588-4CE8-BF2D-B9D68F0194CE}">
+<ds:datastoreItem xmlns:ds="http://schemas.openxmlformats.org/officeDocument/2006/customXml" ds:itemID="{8F5F6066-0595-45A6-9911-2D6D1403F8ED}">
   <ds:schemaRefs>
     <ds:schemaRef ds:uri="http://schemas.openxmlformats.org/officeDocument/2006/bibliography"/>
   </ds:schemaRefs>

</xml_diff>